<commit_message>
modificaciones y .ova de SGE
</commit_message>
<xml_diff>
--- a/DWES+AD+DAW/DWES-Azure/Captura de saldo de Azure.docx
+++ b/DWES+AD+DAW/DWES-Azure/Captura de saldo de Azure.docx
@@ -184,9 +184,9 @@
           <w:noProof/>
         </w:rPr>
         <w:drawing>
-          <wp:inline distT="0" distB="0" distL="0" distR="0" wp14:anchorId="654F5F6F" wp14:editId="00C5B1C7">
-            <wp:extent cx="5400040" cy="3026410"/>
-            <wp:effectExtent l="0" t="0" r="0" b="2540"/>
+          <wp:inline distT="0" distB="0" distL="0" distR="0" wp14:anchorId="654F5F6F" wp14:editId="75A0BEFC">
+            <wp:extent cx="5400040" cy="1285875"/>
+            <wp:effectExtent l="0" t="0" r="0" b="9525"/>
             <wp:docPr id="1102448436" name="Imagen 1" descr="Una captura de pantalla de una computadora&#10;&#10;El contenido generado por IA puede ser incorrecto."/>
             <wp:cNvGraphicFramePr>
               <a:graphicFrameLocks xmlns:a="http://schemas.openxmlformats.org/drawingml/2006/main" noChangeAspect="1"/>
@@ -200,7 +200,7 @@
                       <a:picLocks noChangeAspect="1" noChangeArrowheads="1"/>
                     </pic:cNvPicPr>
                   </pic:nvPicPr>
-                  <pic:blipFill>
+                  <pic:blipFill rotWithShape="1">
                     <a:blip r:embed="rId5" cstate="print">
                       <a:extLst>
                         <a:ext uri="{28A0092B-C50C-407E-A947-70E740481C1C}">
@@ -208,7 +208,7 @@
                         </a:ext>
                       </a:extLst>
                     </a:blip>
-                    <a:srcRect/>
+                    <a:srcRect b="57512"/>
                     <a:stretch>
                       <a:fillRect/>
                     </a:stretch>
@@ -216,7 +216,7 @@
                   <pic:spPr bwMode="auto">
                     <a:xfrm>
                       <a:off x="0" y="0"/>
-                      <a:ext cx="5400040" cy="3026410"/>
+                      <a:ext cx="5400040" cy="1285875"/>
                     </a:xfrm>
                     <a:prstGeom prst="rect">
                       <a:avLst/>
@@ -225,6 +225,11 @@
                     <a:ln>
                       <a:noFill/>
                     </a:ln>
+                    <a:extLst>
+                      <a:ext uri="{53640926-AAD7-44D8-BBD7-CCE9431645EC}">
+                        <a14:shadowObscured xmlns:a14="http://schemas.microsoft.com/office/drawing/2010/main"/>
+                      </a:ext>
+                    </a:extLst>
                   </pic:spPr>
                 </pic:pic>
               </a:graphicData>
@@ -233,7 +238,6 @@
         </w:drawing>
       </w:r>
     </w:p>
-    <w:p/>
     <w:p>
       <w:pPr>
         <w:pStyle w:val="Prrafodelista"/>
@@ -252,7 +256,7 @@
           <w:noProof/>
         </w:rPr>
         <w:drawing>
-          <wp:inline distT="0" distB="0" distL="0" distR="0" wp14:anchorId="4C11E9DD" wp14:editId="07E1E974">
+          <wp:inline distT="0" distB="0" distL="0" distR="0" wp14:anchorId="4C11E9DD" wp14:editId="2FC07B9D">
             <wp:extent cx="5391150" cy="1600200"/>
             <wp:effectExtent l="0" t="0" r="0" b="0"/>
             <wp:docPr id="1344165331" name="Imagen 2"/>
@@ -375,6 +379,286 @@
       </w:pPr>
       <w:r>
         <w:t xml:space="preserve">Captura de </w:t>
+      </w:r>
+      <w:r>
+        <w:t>Grupos de recursos</w:t>
+      </w:r>
+    </w:p>
+    <w:p>
+      <w:pPr>
+        <w:pStyle w:val="Prrafodelista"/>
+      </w:pPr>
+    </w:p>
+    <w:p>
+      <w:pPr>
+        <w:pStyle w:val="Prrafodelista"/>
+        <w:ind w:left="0" w:right="-1"/>
+      </w:pPr>
+      <w:r>
+        <w:drawing>
+          <wp:inline distT="0" distB="0" distL="0" distR="0" wp14:anchorId="59870CB3" wp14:editId="64AB9ACC">
+            <wp:extent cx="5426302" cy="1181100"/>
+            <wp:effectExtent l="0" t="0" r="3175" b="0"/>
+            <wp:docPr id="925632740" name="Imagen 1"/>
+            <wp:cNvGraphicFramePr>
+              <a:graphicFrameLocks xmlns:a="http://schemas.openxmlformats.org/drawingml/2006/main" noChangeAspect="1"/>
+            </wp:cNvGraphicFramePr>
+            <a:graphic xmlns:a="http://schemas.openxmlformats.org/drawingml/2006/main">
+              <a:graphicData uri="http://schemas.openxmlformats.org/drawingml/2006/picture">
+                <pic:pic xmlns:pic="http://schemas.openxmlformats.org/drawingml/2006/picture">
+                  <pic:nvPicPr>
+                    <pic:cNvPr id="925632740" name=""/>
+                    <pic:cNvPicPr/>
+                  </pic:nvPicPr>
+                  <pic:blipFill>
+                    <a:blip r:embed="rId7"/>
+                    <a:stretch>
+                      <a:fillRect/>
+                    </a:stretch>
+                  </pic:blipFill>
+                  <pic:spPr>
+                    <a:xfrm>
+                      <a:off x="0" y="0"/>
+                      <a:ext cx="5665586" cy="1233183"/>
+                    </a:xfrm>
+                    <a:prstGeom prst="rect">
+                      <a:avLst/>
+                    </a:prstGeom>
+                  </pic:spPr>
+                </pic:pic>
+              </a:graphicData>
+            </a:graphic>
+          </wp:inline>
+        </w:drawing>
+      </w:r>
+    </w:p>
+    <w:p>
+      <w:pPr>
+        <w:pStyle w:val="Prrafodelista"/>
+      </w:pPr>
+    </w:p>
+    <w:p>
+      <w:pPr>
+        <w:pStyle w:val="Prrafodelista"/>
+        <w:numPr>
+          <w:ilvl w:val="0"/>
+          <w:numId w:val="1"/>
+        </w:numPr>
+      </w:pPr>
+      <w:r>
+        <w:t>Captura de redes virtuales</w:t>
+      </w:r>
+    </w:p>
+    <w:p>
+      <w:pPr>
+        <w:pStyle w:val="Prrafodelista"/>
+        <w:ind w:left="0"/>
+      </w:pPr>
+      <w:r>
+        <w:drawing>
+          <wp:inline distT="0" distB="0" distL="0" distR="0" wp14:anchorId="106E67AB" wp14:editId="3F11B438">
+            <wp:extent cx="5507417" cy="1009650"/>
+            <wp:effectExtent l="0" t="0" r="0" b="0"/>
+            <wp:docPr id="1901800327" name="Imagen 1"/>
+            <wp:cNvGraphicFramePr>
+              <a:graphicFrameLocks xmlns:a="http://schemas.openxmlformats.org/drawingml/2006/main" noChangeAspect="1"/>
+            </wp:cNvGraphicFramePr>
+            <a:graphic xmlns:a="http://schemas.openxmlformats.org/drawingml/2006/main">
+              <a:graphicData uri="http://schemas.openxmlformats.org/drawingml/2006/picture">
+                <pic:pic xmlns:pic="http://schemas.openxmlformats.org/drawingml/2006/picture">
+                  <pic:nvPicPr>
+                    <pic:cNvPr id="1901800327" name=""/>
+                    <pic:cNvPicPr/>
+                  </pic:nvPicPr>
+                  <pic:blipFill>
+                    <a:blip r:embed="rId8"/>
+                    <a:stretch>
+                      <a:fillRect/>
+                    </a:stretch>
+                  </pic:blipFill>
+                  <pic:spPr>
+                    <a:xfrm>
+                      <a:off x="0" y="0"/>
+                      <a:ext cx="5510551" cy="1010225"/>
+                    </a:xfrm>
+                    <a:prstGeom prst="rect">
+                      <a:avLst/>
+                    </a:prstGeom>
+                  </pic:spPr>
+                </pic:pic>
+              </a:graphicData>
+            </a:graphic>
+          </wp:inline>
+        </w:drawing>
+      </w:r>
+    </w:p>
+    <w:p>
+      <w:pPr>
+        <w:pStyle w:val="Prrafodelista"/>
+        <w:numPr>
+          <w:ilvl w:val="0"/>
+          <w:numId w:val="1"/>
+        </w:numPr>
+      </w:pPr>
+      <w:r>
+        <w:t>Captura de las primeras subredes virtuales</w:t>
+      </w:r>
+    </w:p>
+    <w:p>
+      <w:pPr>
+        <w:pStyle w:val="Prrafodelista"/>
+        <w:ind w:left="0"/>
+      </w:pPr>
+      <w:r>
+        <w:lastRenderedPageBreak/>
+        <w:drawing>
+          <wp:inline distT="0" distB="0" distL="0" distR="0" wp14:anchorId="3387C5DF" wp14:editId="47017C95">
+            <wp:extent cx="5400040" cy="1090930"/>
+            <wp:effectExtent l="0" t="0" r="0" b="0"/>
+            <wp:docPr id="2043410344" name="Imagen 1" descr="Interfaz de usuario gráfica, Texto, Aplicación, Correo electrónico&#10;&#10;El contenido generado por IA puede ser incorrecto."/>
+            <wp:cNvGraphicFramePr>
+              <a:graphicFrameLocks xmlns:a="http://schemas.openxmlformats.org/drawingml/2006/main" noChangeAspect="1"/>
+            </wp:cNvGraphicFramePr>
+            <a:graphic xmlns:a="http://schemas.openxmlformats.org/drawingml/2006/main">
+              <a:graphicData uri="http://schemas.openxmlformats.org/drawingml/2006/picture">
+                <pic:pic xmlns:pic="http://schemas.openxmlformats.org/drawingml/2006/picture">
+                  <pic:nvPicPr>
+                    <pic:cNvPr id="2043410344" name="Imagen 1" descr="Interfaz de usuario gráfica, Texto, Aplicación, Correo electrónico&#10;&#10;El contenido generado por IA puede ser incorrecto."/>
+                    <pic:cNvPicPr/>
+                  </pic:nvPicPr>
+                  <pic:blipFill>
+                    <a:blip r:embed="rId9"/>
+                    <a:stretch>
+                      <a:fillRect/>
+                    </a:stretch>
+                  </pic:blipFill>
+                  <pic:spPr>
+                    <a:xfrm>
+                      <a:off x="0" y="0"/>
+                      <a:ext cx="5400040" cy="1090930"/>
+                    </a:xfrm>
+                    <a:prstGeom prst="rect">
+                      <a:avLst/>
+                    </a:prstGeom>
+                  </pic:spPr>
+                </pic:pic>
+              </a:graphicData>
+            </a:graphic>
+          </wp:inline>
+        </w:drawing>
+      </w:r>
+    </w:p>
+    <w:p>
+      <w:pPr>
+        <w:pStyle w:val="Prrafodelista"/>
+        <w:numPr>
+          <w:ilvl w:val="0"/>
+          <w:numId w:val="1"/>
+        </w:numPr>
+      </w:pPr>
+      <w:r>
+        <w:t xml:space="preserve">Captura de </w:t>
+      </w:r>
+      <w:r>
+        <w:t>las dos redes virtuales</w:t>
+      </w:r>
+    </w:p>
+    <w:p>
+      <w:pPr>
+        <w:pStyle w:val="Prrafodelista"/>
+        <w:ind w:left="0"/>
+      </w:pPr>
+      <w:r>
+        <w:drawing>
+          <wp:inline distT="0" distB="0" distL="0" distR="0" wp14:anchorId="245FC9B1" wp14:editId="5E200A19">
+            <wp:extent cx="5400040" cy="1088390"/>
+            <wp:effectExtent l="0" t="0" r="0" b="0"/>
+            <wp:docPr id="1378309390" name="Imagen 1"/>
+            <wp:cNvGraphicFramePr>
+              <a:graphicFrameLocks xmlns:a="http://schemas.openxmlformats.org/drawingml/2006/main" noChangeAspect="1"/>
+            </wp:cNvGraphicFramePr>
+            <a:graphic xmlns:a="http://schemas.openxmlformats.org/drawingml/2006/main">
+              <a:graphicData uri="http://schemas.openxmlformats.org/drawingml/2006/picture">
+                <pic:pic xmlns:pic="http://schemas.openxmlformats.org/drawingml/2006/picture">
+                  <pic:nvPicPr>
+                    <pic:cNvPr id="1378309390" name=""/>
+                    <pic:cNvPicPr/>
+                  </pic:nvPicPr>
+                  <pic:blipFill>
+                    <a:blip r:embed="rId10"/>
+                    <a:stretch>
+                      <a:fillRect/>
+                    </a:stretch>
+                  </pic:blipFill>
+                  <pic:spPr>
+                    <a:xfrm>
+                      <a:off x="0" y="0"/>
+                      <a:ext cx="5400040" cy="1088390"/>
+                    </a:xfrm>
+                    <a:prstGeom prst="rect">
+                      <a:avLst/>
+                    </a:prstGeom>
+                  </pic:spPr>
+                </pic:pic>
+              </a:graphicData>
+            </a:graphic>
+          </wp:inline>
+        </w:drawing>
+      </w:r>
+    </w:p>
+    <w:p>
+      <w:pPr>
+        <w:pStyle w:val="Prrafodelista"/>
+        <w:numPr>
+          <w:ilvl w:val="0"/>
+          <w:numId w:val="1"/>
+        </w:numPr>
+      </w:pPr>
+      <w:r>
+        <w:t>Captura de las subredes virtuales de la segunda red virtual</w:t>
+      </w:r>
+    </w:p>
+    <w:p>
+      <w:pPr>
+        <w:pStyle w:val="Prrafodelista"/>
+        <w:ind w:left="0"/>
+      </w:pPr>
+      <w:r>
+        <w:drawing>
+          <wp:inline distT="0" distB="0" distL="0" distR="0" wp14:anchorId="153469AB" wp14:editId="13DC5F26">
+            <wp:extent cx="5400040" cy="1060450"/>
+            <wp:effectExtent l="0" t="0" r="0" b="6350"/>
+            <wp:docPr id="1825014990" name="Imagen 1"/>
+            <wp:cNvGraphicFramePr>
+              <a:graphicFrameLocks xmlns:a="http://schemas.openxmlformats.org/drawingml/2006/main" noChangeAspect="1"/>
+            </wp:cNvGraphicFramePr>
+            <a:graphic xmlns:a="http://schemas.openxmlformats.org/drawingml/2006/main">
+              <a:graphicData uri="http://schemas.openxmlformats.org/drawingml/2006/picture">
+                <pic:pic xmlns:pic="http://schemas.openxmlformats.org/drawingml/2006/picture">
+                  <pic:nvPicPr>
+                    <pic:cNvPr id="1825014990" name=""/>
+                    <pic:cNvPicPr/>
+                  </pic:nvPicPr>
+                  <pic:blipFill>
+                    <a:blip r:embed="rId11"/>
+                    <a:stretch>
+                      <a:fillRect/>
+                    </a:stretch>
+                  </pic:blipFill>
+                  <pic:spPr>
+                    <a:xfrm>
+                      <a:off x="0" y="0"/>
+                      <a:ext cx="5400040" cy="1060450"/>
+                    </a:xfrm>
+                    <a:prstGeom prst="rect">
+                      <a:avLst/>
+                    </a:prstGeom>
+                  </pic:spPr>
+                </pic:pic>
+              </a:graphicData>
+            </a:graphic>
+          </wp:inline>
+        </w:drawing>
       </w:r>
     </w:p>
     <w:sectPr>

</xml_diff>

<commit_message>
Modificación del día 24/10/25
</commit_message>
<xml_diff>
--- a/DWES+AD+DAW/DWES-Azure/Captura de saldo de Azure.docx
+++ b/DWES+AD+DAW/DWES-Azure/Captura de saldo de Azure.docx
@@ -184,7 +184,7 @@
           <w:noProof/>
         </w:rPr>
         <w:drawing>
-          <wp:inline distT="0" distB="0" distL="0" distR="0" wp14:anchorId="654F5F6F" wp14:editId="75A0BEFC">
+          <wp:inline distT="0" distB="0" distL="0" distR="0" wp14:anchorId="654F5F6F" wp14:editId="081CED97">
             <wp:extent cx="5400040" cy="1285875"/>
             <wp:effectExtent l="0" t="0" r="0" b="9525"/>
             <wp:docPr id="1102448436" name="Imagen 1" descr="Una captura de pantalla de una computadora&#10;&#10;El contenido generado por IA puede ser incorrecto."/>
@@ -256,7 +256,7 @@
           <w:noProof/>
         </w:rPr>
         <w:drawing>
-          <wp:inline distT="0" distB="0" distL="0" distR="0" wp14:anchorId="4C11E9DD" wp14:editId="2FC07B9D">
+          <wp:inline distT="0" distB="0" distL="0" distR="0" wp14:anchorId="4C11E9DD" wp14:editId="7F44A939">
             <wp:extent cx="5391150" cy="1600200"/>
             <wp:effectExtent l="0" t="0" r="0" b="0"/>
             <wp:docPr id="1344165331" name="Imagen 2"/>
@@ -395,6 +395,9 @@
         <w:ind w:left="0" w:right="-1"/>
       </w:pPr>
       <w:r>
+        <w:rPr>
+          <w:noProof/>
+        </w:rPr>
         <w:drawing>
           <wp:inline distT="0" distB="0" distL="0" distR="0" wp14:anchorId="59870CB3" wp14:editId="64AB9ACC">
             <wp:extent cx="5426302" cy="1181100"/>
@@ -455,6 +458,9 @@
         <w:ind w:left="0"/>
       </w:pPr>
       <w:r>
+        <w:rPr>
+          <w:noProof/>
+        </w:rPr>
         <w:drawing>
           <wp:inline distT="0" distB="0" distL="0" distR="0" wp14:anchorId="106E67AB" wp14:editId="3F11B438">
             <wp:extent cx="5507417" cy="1009650"/>
@@ -510,6 +516,9 @@
         <w:ind w:left="0"/>
       </w:pPr>
       <w:r>
+        <w:rPr>
+          <w:noProof/>
+        </w:rPr>
         <w:lastRenderedPageBreak/>
         <w:drawing>
           <wp:inline distT="0" distB="0" distL="0" distR="0" wp14:anchorId="3387C5DF" wp14:editId="47017C95">
@@ -569,6 +578,9 @@
         <w:ind w:left="0"/>
       </w:pPr>
       <w:r>
+        <w:rPr>
+          <w:noProof/>
+        </w:rPr>
         <w:drawing>
           <wp:inline distT="0" distB="0" distL="0" distR="0" wp14:anchorId="245FC9B1" wp14:editId="5E200A19">
             <wp:extent cx="5400040" cy="1088390"/>
@@ -625,10 +637,10 @@
       </w:pPr>
       <w:r>
         <w:drawing>
-          <wp:inline distT="0" distB="0" distL="0" distR="0" wp14:anchorId="153469AB" wp14:editId="13DC5F26">
-            <wp:extent cx="5400040" cy="1060450"/>
-            <wp:effectExtent l="0" t="0" r="0" b="6350"/>
-            <wp:docPr id="1825014990" name="Imagen 1"/>
+          <wp:inline distT="0" distB="0" distL="0" distR="0" wp14:anchorId="34FFD094" wp14:editId="34645E2C">
+            <wp:extent cx="5400040" cy="1110615"/>
+            <wp:effectExtent l="0" t="0" r="0" b="0"/>
+            <wp:docPr id="1451684025" name="Imagen 1" descr="Interfaz de usuario gráfica, Texto, Aplicación, Correo electrónico&#10;&#10;El contenido generado por IA puede ser incorrecto."/>
             <wp:cNvGraphicFramePr>
               <a:graphicFrameLocks xmlns:a="http://schemas.openxmlformats.org/drawingml/2006/main" noChangeAspect="1"/>
             </wp:cNvGraphicFramePr>
@@ -636,7 +648,7 @@
               <a:graphicData uri="http://schemas.openxmlformats.org/drawingml/2006/picture">
                 <pic:pic xmlns:pic="http://schemas.openxmlformats.org/drawingml/2006/picture">
                   <pic:nvPicPr>
-                    <pic:cNvPr id="1825014990" name=""/>
+                    <pic:cNvPr id="1451684025" name="Imagen 1" descr="Interfaz de usuario gráfica, Texto, Aplicación, Correo electrónico&#10;&#10;El contenido generado por IA puede ser incorrecto."/>
                     <pic:cNvPicPr/>
                   </pic:nvPicPr>
                   <pic:blipFill>
@@ -648,7 +660,7 @@
                   <pic:spPr>
                     <a:xfrm>
                       <a:off x="0" y="0"/>
-                      <a:ext cx="5400040" cy="1060450"/>
+                      <a:ext cx="5400040" cy="1110615"/>
                     </a:xfrm>
                     <a:prstGeom prst="rect">
                       <a:avLst/>
@@ -660,6 +672,198 @@
           </wp:inline>
         </w:drawing>
       </w:r>
+    </w:p>
+    <w:p>
+      <w:pPr>
+        <w:pStyle w:val="Prrafodelista"/>
+        <w:ind w:left="0"/>
+      </w:pPr>
+    </w:p>
+    <w:p>
+      <w:pPr>
+        <w:pStyle w:val="Prrafodelista"/>
+        <w:numPr>
+          <w:ilvl w:val="0"/>
+          <w:numId w:val="1"/>
+        </w:numPr>
+      </w:pPr>
+      <w:r>
+        <w:t xml:space="preserve">Captura de los grupos de seguridad de red </w:t>
+      </w:r>
+    </w:p>
+    <w:p>
+      <w:pPr>
+        <w:pStyle w:val="Prrafodelista"/>
+        <w:ind w:left="0"/>
+      </w:pPr>
+      <w:r>
+        <w:drawing>
+          <wp:inline distT="0" distB="0" distL="0" distR="0" wp14:anchorId="06E304A9" wp14:editId="69E3569B">
+            <wp:extent cx="5400040" cy="1054735"/>
+            <wp:effectExtent l="0" t="0" r="0" b="0"/>
+            <wp:docPr id="113640581" name="Imagen 1" descr="Interfaz de usuario gráfica, Texto, Aplicación, Correo electrónico&#10;&#10;El contenido generado por IA puede ser incorrecto."/>
+            <wp:cNvGraphicFramePr>
+              <a:graphicFrameLocks xmlns:a="http://schemas.openxmlformats.org/drawingml/2006/main" noChangeAspect="1"/>
+            </wp:cNvGraphicFramePr>
+            <a:graphic xmlns:a="http://schemas.openxmlformats.org/drawingml/2006/main">
+              <a:graphicData uri="http://schemas.openxmlformats.org/drawingml/2006/picture">
+                <pic:pic xmlns:pic="http://schemas.openxmlformats.org/drawingml/2006/picture">
+                  <pic:nvPicPr>
+                    <pic:cNvPr id="113640581" name="Imagen 1" descr="Interfaz de usuario gráfica, Texto, Aplicación, Correo electrónico&#10;&#10;El contenido generado por IA puede ser incorrecto."/>
+                    <pic:cNvPicPr/>
+                  </pic:nvPicPr>
+                  <pic:blipFill>
+                    <a:blip r:embed="rId12"/>
+                    <a:stretch>
+                      <a:fillRect/>
+                    </a:stretch>
+                  </pic:blipFill>
+                  <pic:spPr>
+                    <a:xfrm>
+                      <a:off x="0" y="0"/>
+                      <a:ext cx="5400040" cy="1054735"/>
+                    </a:xfrm>
+                    <a:prstGeom prst="rect">
+                      <a:avLst/>
+                    </a:prstGeom>
+                  </pic:spPr>
+                </pic:pic>
+              </a:graphicData>
+            </a:graphic>
+          </wp:inline>
+        </w:drawing>
+      </w:r>
+    </w:p>
+    <w:p>
+      <w:pPr>
+        <w:pStyle w:val="Prrafodelista"/>
+        <w:numPr>
+          <w:ilvl w:val="0"/>
+          <w:numId w:val="1"/>
+        </w:numPr>
+      </w:pPr>
+      <w:r>
+        <w:t>Captura de las reglas de seguridad de entrada</w:t>
+      </w:r>
+    </w:p>
+    <w:p>
+      <w:pPr>
+        <w:pStyle w:val="Prrafodelista"/>
+        <w:ind w:left="0"/>
+      </w:pPr>
+      <w:r>
+        <w:drawing>
+          <wp:inline distT="0" distB="0" distL="0" distR="0" wp14:anchorId="67ED4D9B" wp14:editId="412E770C">
+            <wp:extent cx="5400040" cy="1358265"/>
+            <wp:effectExtent l="0" t="0" r="0" b="0"/>
+            <wp:docPr id="938387136" name="Imagen 1" descr="Interfaz de usuario gráfica, Texto, Aplicación, Correo electrónico&#10;&#10;El contenido generado por IA puede ser incorrecto."/>
+            <wp:cNvGraphicFramePr>
+              <a:graphicFrameLocks xmlns:a="http://schemas.openxmlformats.org/drawingml/2006/main" noChangeAspect="1"/>
+            </wp:cNvGraphicFramePr>
+            <a:graphic xmlns:a="http://schemas.openxmlformats.org/drawingml/2006/main">
+              <a:graphicData uri="http://schemas.openxmlformats.org/drawingml/2006/picture">
+                <pic:pic xmlns:pic="http://schemas.openxmlformats.org/drawingml/2006/picture">
+                  <pic:nvPicPr>
+                    <pic:cNvPr id="938387136" name="Imagen 1" descr="Interfaz de usuario gráfica, Texto, Aplicación, Correo electrónico&#10;&#10;El contenido generado por IA puede ser incorrecto."/>
+                    <pic:cNvPicPr/>
+                  </pic:nvPicPr>
+                  <pic:blipFill>
+                    <a:blip r:embed="rId13"/>
+                    <a:stretch>
+                      <a:fillRect/>
+                    </a:stretch>
+                  </pic:blipFill>
+                  <pic:spPr>
+                    <a:xfrm>
+                      <a:off x="0" y="0"/>
+                      <a:ext cx="5400040" cy="1358265"/>
+                    </a:xfrm>
+                    <a:prstGeom prst="rect">
+                      <a:avLst/>
+                    </a:prstGeom>
+                  </pic:spPr>
+                </pic:pic>
+              </a:graphicData>
+            </a:graphic>
+          </wp:inline>
+        </w:drawing>
+      </w:r>
+    </w:p>
+    <w:p>
+      <w:pPr>
+        <w:pStyle w:val="Prrafodelista"/>
+        <w:numPr>
+          <w:ilvl w:val="0"/>
+          <w:numId w:val="1"/>
+        </w:numPr>
+      </w:pPr>
+      <w:r>
+        <w:t xml:space="preserve">Captura de </w:t>
+      </w:r>
+      <w:r>
+        <w:t>la asociación de las subredes al grupo de seguridad de red</w:t>
+      </w:r>
+    </w:p>
+    <w:p>
+      <w:pPr>
+        <w:pStyle w:val="Prrafodelista"/>
+        <w:ind w:left="0"/>
+      </w:pPr>
+      <w:r>
+        <w:drawing>
+          <wp:inline distT="0" distB="0" distL="0" distR="0" wp14:anchorId="06456A04" wp14:editId="2A2C2306">
+            <wp:extent cx="5400040" cy="1040765"/>
+            <wp:effectExtent l="0" t="0" r="0" b="6985"/>
+            <wp:docPr id="586772584" name="Imagen 1" descr="Interfaz de usuario gráfica, Aplicación&#10;&#10;El contenido generado por IA puede ser incorrecto."/>
+            <wp:cNvGraphicFramePr>
+              <a:graphicFrameLocks xmlns:a="http://schemas.openxmlformats.org/drawingml/2006/main" noChangeAspect="1"/>
+            </wp:cNvGraphicFramePr>
+            <a:graphic xmlns:a="http://schemas.openxmlformats.org/drawingml/2006/main">
+              <a:graphicData uri="http://schemas.openxmlformats.org/drawingml/2006/picture">
+                <pic:pic xmlns:pic="http://schemas.openxmlformats.org/drawingml/2006/picture">
+                  <pic:nvPicPr>
+                    <pic:cNvPr id="586772584" name="Imagen 1" descr="Interfaz de usuario gráfica, Aplicación&#10;&#10;El contenido generado por IA puede ser incorrecto."/>
+                    <pic:cNvPicPr/>
+                  </pic:nvPicPr>
+                  <pic:blipFill>
+                    <a:blip r:embed="rId14"/>
+                    <a:stretch>
+                      <a:fillRect/>
+                    </a:stretch>
+                  </pic:blipFill>
+                  <pic:spPr>
+                    <a:xfrm>
+                      <a:off x="0" y="0"/>
+                      <a:ext cx="5400040" cy="1040765"/>
+                    </a:xfrm>
+                    <a:prstGeom prst="rect">
+                      <a:avLst/>
+                    </a:prstGeom>
+                  </pic:spPr>
+                </pic:pic>
+              </a:graphicData>
+            </a:graphic>
+          </wp:inline>
+        </w:drawing>
+      </w:r>
+    </w:p>
+    <w:p>
+      <w:pPr>
+        <w:pStyle w:val="Prrafodelista"/>
+        <w:numPr>
+          <w:ilvl w:val="0"/>
+          <w:numId w:val="1"/>
+        </w:numPr>
+      </w:pPr>
+      <w:r>
+        <w:t xml:space="preserve">Captura de </w:t>
+      </w:r>
+    </w:p>
+    <w:p>
+      <w:pPr>
+        <w:pStyle w:val="Prrafodelista"/>
+        <w:ind w:left="0"/>
+      </w:pPr>
     </w:p>
     <w:sectPr>
       <w:pgSz w:w="11906" w:h="16838"/>

</xml_diff>

<commit_message>
Modificación del repositorio del dia 27/10/2025
</commit_message>
<xml_diff>
--- a/DWES+AD+DAW/DWES-Azure/Captura de saldo de Azure.docx
+++ b/DWES+AD+DAW/DWES-Azure/Captura de saldo de Azure.docx
@@ -184,7 +184,7 @@
           <w:noProof/>
         </w:rPr>
         <w:drawing>
-          <wp:inline distT="0" distB="0" distL="0" distR="0" wp14:anchorId="654F5F6F" wp14:editId="081CED97">
+          <wp:inline distT="0" distB="0" distL="0" distR="0" wp14:anchorId="654F5F6F" wp14:editId="330A2CED">
             <wp:extent cx="5400040" cy="1285875"/>
             <wp:effectExtent l="0" t="0" r="0" b="9525"/>
             <wp:docPr id="1102448436" name="Imagen 1" descr="Una captura de pantalla de una computadora&#10;&#10;El contenido generado por IA puede ser incorrecto."/>
@@ -256,7 +256,7 @@
           <w:noProof/>
         </w:rPr>
         <w:drawing>
-          <wp:inline distT="0" distB="0" distL="0" distR="0" wp14:anchorId="4C11E9DD" wp14:editId="7F44A939">
+          <wp:inline distT="0" distB="0" distL="0" distR="0" wp14:anchorId="4C11E9DD" wp14:editId="5B2845CA">
             <wp:extent cx="5391150" cy="1600200"/>
             <wp:effectExtent l="0" t="0" r="0" b="0"/>
             <wp:docPr id="1344165331" name="Imagen 2"/>
@@ -636,6 +636,9 @@
         <w:ind w:left="0"/>
       </w:pPr>
       <w:r>
+        <w:rPr>
+          <w:noProof/>
+        </w:rPr>
         <w:drawing>
           <wp:inline distT="0" distB="0" distL="0" distR="0" wp14:anchorId="34FFD094" wp14:editId="34645E2C">
             <wp:extent cx="5400040" cy="1110615"/>
@@ -697,6 +700,9 @@
         <w:ind w:left="0"/>
       </w:pPr>
       <w:r>
+        <w:rPr>
+          <w:noProof/>
+        </w:rPr>
         <w:drawing>
           <wp:inline distT="0" distB="0" distL="0" distR="0" wp14:anchorId="06E304A9" wp14:editId="69E3569B">
             <wp:extent cx="5400040" cy="1054735"/>
@@ -752,6 +758,9 @@
         <w:ind w:left="0"/>
       </w:pPr>
       <w:r>
+        <w:rPr>
+          <w:noProof/>
+        </w:rPr>
         <w:drawing>
           <wp:inline distT="0" distB="0" distL="0" distR="0" wp14:anchorId="67ED4D9B" wp14:editId="412E770C">
             <wp:extent cx="5400040" cy="1358265"/>
@@ -810,6 +819,9 @@
         <w:ind w:left="0"/>
       </w:pPr>
       <w:r>
+        <w:rPr>
+          <w:noProof/>
+        </w:rPr>
         <w:drawing>
           <wp:inline distT="0" distB="0" distL="0" distR="0" wp14:anchorId="06456A04" wp14:editId="2A2C2306">
             <wp:extent cx="5400040" cy="1040765"/>
@@ -835,6 +847,292 @@
                     <a:xfrm>
                       <a:off x="0" y="0"/>
                       <a:ext cx="5400040" cy="1040765"/>
+                    </a:xfrm>
+                    <a:prstGeom prst="rect">
+                      <a:avLst/>
+                    </a:prstGeom>
+                  </pic:spPr>
+                </pic:pic>
+              </a:graphicData>
+            </a:graphic>
+          </wp:inline>
+        </w:drawing>
+      </w:r>
+    </w:p>
+    <w:p>
+      <w:pPr>
+        <w:pStyle w:val="Prrafodelista"/>
+        <w:numPr>
+          <w:ilvl w:val="0"/>
+          <w:numId w:val="1"/>
+        </w:numPr>
+      </w:pPr>
+      <w:r>
+        <w:t>Captura de</w:t>
+      </w:r>
+      <w:r>
+        <w:t>l listado de máquinas virtuales</w:t>
+      </w:r>
+    </w:p>
+    <w:p>
+      <w:pPr>
+        <w:pStyle w:val="Prrafodelista"/>
+        <w:ind w:left="0"/>
+      </w:pPr>
+      <w:r>
+        <w:lastRenderedPageBreak/>
+        <w:drawing>
+          <wp:inline distT="0" distB="0" distL="0" distR="0" wp14:anchorId="2A50CFFE" wp14:editId="15612FDC">
+            <wp:extent cx="5400040" cy="1060450"/>
+            <wp:effectExtent l="0" t="0" r="0" b="6350"/>
+            <wp:docPr id="1052175345" name="Imagen 1" descr="Interfaz de usuario gráfica, Texto, Aplicación, Correo electrónico&#10;&#10;El contenido generado por IA puede ser incorrecto."/>
+            <wp:cNvGraphicFramePr>
+              <a:graphicFrameLocks xmlns:a="http://schemas.openxmlformats.org/drawingml/2006/main" noChangeAspect="1"/>
+            </wp:cNvGraphicFramePr>
+            <a:graphic xmlns:a="http://schemas.openxmlformats.org/drawingml/2006/main">
+              <a:graphicData uri="http://schemas.openxmlformats.org/drawingml/2006/picture">
+                <pic:pic xmlns:pic="http://schemas.openxmlformats.org/drawingml/2006/picture">
+                  <pic:nvPicPr>
+                    <pic:cNvPr id="1052175345" name="Imagen 1" descr="Interfaz de usuario gráfica, Texto, Aplicación, Correo electrónico&#10;&#10;El contenido generado por IA puede ser incorrecto."/>
+                    <pic:cNvPicPr/>
+                  </pic:nvPicPr>
+                  <pic:blipFill>
+                    <a:blip r:embed="rId15"/>
+                    <a:stretch>
+                      <a:fillRect/>
+                    </a:stretch>
+                  </pic:blipFill>
+                  <pic:spPr>
+                    <a:xfrm>
+                      <a:off x="0" y="0"/>
+                      <a:ext cx="5400040" cy="1060450"/>
+                    </a:xfrm>
+                    <a:prstGeom prst="rect">
+                      <a:avLst/>
+                    </a:prstGeom>
+                  </pic:spPr>
+                </pic:pic>
+              </a:graphicData>
+            </a:graphic>
+          </wp:inline>
+        </w:drawing>
+      </w:r>
+    </w:p>
+    <w:p>
+      <w:pPr>
+        <w:pStyle w:val="Prrafodelista"/>
+        <w:numPr>
+          <w:ilvl w:val="0"/>
+          <w:numId w:val="1"/>
+        </w:numPr>
+      </w:pPr>
+      <w:r>
+        <w:t>Captura de la información general de la máquina virtual</w:t>
+      </w:r>
+    </w:p>
+    <w:p>
+      <w:pPr>
+        <w:pStyle w:val="Prrafodelista"/>
+        <w:ind w:left="0"/>
+      </w:pPr>
+      <w:r>
+        <w:drawing>
+          <wp:inline distT="0" distB="0" distL="0" distR="0" wp14:anchorId="226DE878" wp14:editId="289A7766">
+            <wp:extent cx="5400040" cy="1341755"/>
+            <wp:effectExtent l="0" t="0" r="0" b="0"/>
+            <wp:docPr id="1043589233" name="Imagen 1" descr="Interfaz de usuario gráfica, Texto, Aplicación, Correo electrónico&#10;&#10;El contenido generado por IA puede ser incorrecto."/>
+            <wp:cNvGraphicFramePr>
+              <a:graphicFrameLocks xmlns:a="http://schemas.openxmlformats.org/drawingml/2006/main" noChangeAspect="1"/>
+            </wp:cNvGraphicFramePr>
+            <a:graphic xmlns:a="http://schemas.openxmlformats.org/drawingml/2006/main">
+              <a:graphicData uri="http://schemas.openxmlformats.org/drawingml/2006/picture">
+                <pic:pic xmlns:pic="http://schemas.openxmlformats.org/drawingml/2006/picture">
+                  <pic:nvPicPr>
+                    <pic:cNvPr id="1043589233" name="Imagen 1" descr="Interfaz de usuario gráfica, Texto, Aplicación, Correo electrónico&#10;&#10;El contenido generado por IA puede ser incorrecto."/>
+                    <pic:cNvPicPr/>
+                  </pic:nvPicPr>
+                  <pic:blipFill>
+                    <a:blip r:embed="rId16"/>
+                    <a:stretch>
+                      <a:fillRect/>
+                    </a:stretch>
+                  </pic:blipFill>
+                  <pic:spPr>
+                    <a:xfrm>
+                      <a:off x="0" y="0"/>
+                      <a:ext cx="5400040" cy="1341755"/>
+                    </a:xfrm>
+                    <a:prstGeom prst="rect">
+                      <a:avLst/>
+                    </a:prstGeom>
+                  </pic:spPr>
+                </pic:pic>
+              </a:graphicData>
+            </a:graphic>
+          </wp:inline>
+        </w:drawing>
+      </w:r>
+    </w:p>
+    <w:p>
+      <w:pPr>
+        <w:pStyle w:val="Prrafodelista"/>
+        <w:numPr>
+          <w:ilvl w:val="0"/>
+          <w:numId w:val="1"/>
+        </w:numPr>
+      </w:pPr>
+      <w:r>
+        <w:t xml:space="preserve">Captura de </w:t>
+      </w:r>
+      <w:r>
+        <w:t>conexión a la máquina virtual</w:t>
+      </w:r>
+    </w:p>
+    <w:p>
+      <w:pPr>
+        <w:pStyle w:val="Prrafodelista"/>
+        <w:ind w:left="0"/>
+      </w:pPr>
+      <w:r>
+        <w:drawing>
+          <wp:inline distT="0" distB="0" distL="0" distR="0" wp14:anchorId="6A6A5F18" wp14:editId="2C8AFA5C">
+            <wp:extent cx="5400040" cy="5842635"/>
+            <wp:effectExtent l="0" t="0" r="0" b="5715"/>
+            <wp:docPr id="1274907400" name="Imagen 1" descr="Texto&#10;&#10;El contenido generado por IA puede ser incorrecto."/>
+            <wp:cNvGraphicFramePr>
+              <a:graphicFrameLocks xmlns:a="http://schemas.openxmlformats.org/drawingml/2006/main" noChangeAspect="1"/>
+            </wp:cNvGraphicFramePr>
+            <a:graphic xmlns:a="http://schemas.openxmlformats.org/drawingml/2006/main">
+              <a:graphicData uri="http://schemas.openxmlformats.org/drawingml/2006/picture">
+                <pic:pic xmlns:pic="http://schemas.openxmlformats.org/drawingml/2006/picture">
+                  <pic:nvPicPr>
+                    <pic:cNvPr id="1274907400" name="Imagen 1" descr="Texto&#10;&#10;El contenido generado por IA puede ser incorrecto."/>
+                    <pic:cNvPicPr/>
+                  </pic:nvPicPr>
+                  <pic:blipFill>
+                    <a:blip r:embed="rId17"/>
+                    <a:stretch>
+                      <a:fillRect/>
+                    </a:stretch>
+                  </pic:blipFill>
+                  <pic:spPr>
+                    <a:xfrm>
+                      <a:off x="0" y="0"/>
+                      <a:ext cx="5400040" cy="5842635"/>
+                    </a:xfrm>
+                    <a:prstGeom prst="rect">
+                      <a:avLst/>
+                    </a:prstGeom>
+                  </pic:spPr>
+                </pic:pic>
+              </a:graphicData>
+            </a:graphic>
+          </wp:inline>
+        </w:drawing>
+      </w:r>
+    </w:p>
+    <w:p>
+      <w:pPr>
+        <w:pStyle w:val="Prrafodelista"/>
+        <w:numPr>
+          <w:ilvl w:val="0"/>
+          <w:numId w:val="1"/>
+        </w:numPr>
+      </w:pPr>
+      <w:r>
+        <w:lastRenderedPageBreak/>
+        <w:t xml:space="preserve">Captura de </w:t>
+      </w:r>
+      <w:r>
+        <w:t>las dos máquinas virtuales</w:t>
+      </w:r>
+    </w:p>
+    <w:p>
+      <w:pPr>
+        <w:pStyle w:val="Prrafodelista"/>
+        <w:ind w:left="0"/>
+      </w:pPr>
+      <w:r>
+        <w:drawing>
+          <wp:inline distT="0" distB="0" distL="0" distR="0" wp14:anchorId="33D43C40" wp14:editId="74D173D8">
+            <wp:extent cx="5400040" cy="1120140"/>
+            <wp:effectExtent l="0" t="0" r="0" b="3810"/>
+            <wp:docPr id="706253338" name="Imagen 1" descr="Interfaz de usuario gráfica, Texto, Aplicación&#10;&#10;El contenido generado por IA puede ser incorrecto."/>
+            <wp:cNvGraphicFramePr>
+              <a:graphicFrameLocks xmlns:a="http://schemas.openxmlformats.org/drawingml/2006/main" noChangeAspect="1"/>
+            </wp:cNvGraphicFramePr>
+            <a:graphic xmlns:a="http://schemas.openxmlformats.org/drawingml/2006/main">
+              <a:graphicData uri="http://schemas.openxmlformats.org/drawingml/2006/picture">
+                <pic:pic xmlns:pic="http://schemas.openxmlformats.org/drawingml/2006/picture">
+                  <pic:nvPicPr>
+                    <pic:cNvPr id="706253338" name="Imagen 1" descr="Interfaz de usuario gráfica, Texto, Aplicación&#10;&#10;El contenido generado por IA puede ser incorrecto."/>
+                    <pic:cNvPicPr/>
+                  </pic:nvPicPr>
+                  <pic:blipFill>
+                    <a:blip r:embed="rId18"/>
+                    <a:stretch>
+                      <a:fillRect/>
+                    </a:stretch>
+                  </pic:blipFill>
+                  <pic:spPr>
+                    <a:xfrm>
+                      <a:off x="0" y="0"/>
+                      <a:ext cx="5400040" cy="1120140"/>
+                    </a:xfrm>
+                    <a:prstGeom prst="rect">
+                      <a:avLst/>
+                    </a:prstGeom>
+                  </pic:spPr>
+                </pic:pic>
+              </a:graphicData>
+            </a:graphic>
+          </wp:inline>
+        </w:drawing>
+      </w:r>
+    </w:p>
+    <w:p>
+      <w:pPr>
+        <w:pStyle w:val="Prrafodelista"/>
+        <w:numPr>
+          <w:ilvl w:val="0"/>
+          <w:numId w:val="1"/>
+        </w:numPr>
+      </w:pPr>
+      <w:r>
+        <w:t>Captura de conexión con RDP a la máquina virtual</w:t>
+      </w:r>
+    </w:p>
+    <w:p>
+      <w:pPr>
+        <w:pStyle w:val="Prrafodelista"/>
+        <w:ind w:left="0"/>
+      </w:pPr>
+      <w:r>
+        <w:drawing>
+          <wp:inline distT="0" distB="0" distL="0" distR="0" wp14:anchorId="205296D8" wp14:editId="5FC23038">
+            <wp:extent cx="5400040" cy="960120"/>
+            <wp:effectExtent l="0" t="0" r="0" b="0"/>
+            <wp:docPr id="1427975065" name="Imagen 1" descr="Interfaz de usuario gráfica, Texto, Aplicación&#10;&#10;El contenido generado por IA puede ser incorrecto."/>
+            <wp:cNvGraphicFramePr>
+              <a:graphicFrameLocks xmlns:a="http://schemas.openxmlformats.org/drawingml/2006/main" noChangeAspect="1"/>
+            </wp:cNvGraphicFramePr>
+            <a:graphic xmlns:a="http://schemas.openxmlformats.org/drawingml/2006/main">
+              <a:graphicData uri="http://schemas.openxmlformats.org/drawingml/2006/picture">
+                <pic:pic xmlns:pic="http://schemas.openxmlformats.org/drawingml/2006/picture">
+                  <pic:nvPicPr>
+                    <pic:cNvPr id="1427975065" name="Imagen 1" descr="Interfaz de usuario gráfica, Texto, Aplicación&#10;&#10;El contenido generado por IA puede ser incorrecto."/>
+                    <pic:cNvPicPr/>
+                  </pic:nvPicPr>
+                  <pic:blipFill>
+                    <a:blip r:embed="rId19"/>
+                    <a:stretch>
+                      <a:fillRect/>
+                    </a:stretch>
+                  </pic:blipFill>
+                  <pic:spPr>
+                    <a:xfrm>
+                      <a:off x="0" y="0"/>
+                      <a:ext cx="5400040" cy="960120"/>
                     </a:xfrm>
                     <a:prstGeom prst="rect">
                       <a:avLst/>

</xml_diff>